<commit_message>
Update Doc and MqTT
</commit_message>
<xml_diff>
--- a/Projetos/07-Quali-Enchimento/projeto-07.docx
+++ b/Projetos/07-Quali-Enchimento/projeto-07.docx
@@ -1085,7 +1085,7 @@
         <w:rPr>
           <w:rFonts w:ascii="Abadi" w:eastAsia="Abadi" w:hAnsi="Abadi" w:cs="Abadi"/>
         </w:rPr>
-        <w:t>S3 Heltec V3</w:t>
+        <w:t>S3</w:t>
       </w:r>
     </w:p>
     <w:p>
@@ -1401,7 +1401,6 @@
         <w:spacing w:before="240" w:after="240"/>
         <w:rPr>
           <w:rFonts w:ascii="Abadi" w:eastAsia="Abadi" w:hAnsi="Abadi" w:cs="Abadi"/>
-          <w:highlight w:val="yellow"/>
         </w:rPr>
       </w:pPr>
       <w:r>
@@ -1431,7 +1430,6 @@
         <w:spacing w:after="0"/>
         <w:rPr>
           <w:rFonts w:ascii="Abadi" w:eastAsia="Abadi" w:hAnsi="Abadi" w:cs="Abadi"/>
-          <w:highlight w:val="yellow"/>
         </w:rPr>
       </w:pPr>
       <w:r>
@@ -1452,7 +1450,31 @@
         <w:rPr>
           <w:rFonts w:ascii="Abadi" w:eastAsia="Abadi" w:hAnsi="Abadi" w:cs="Abadi"/>
         </w:rPr>
-        <w:t>Fixe o ESP32-S3 Heltec V3 na protoboard. Conecte o pino TRIG do HC-SR04 ao GPIO 4 e o pino ECHO (passando pelo divisor de tensão) ao GPIO 5. Conecte o pino de sinal do Módulo Relé ao GPIO 15.</w:t>
+        <w:t xml:space="preserve">Fixe o ESP32-S3 na protoboard. Conecte o pino TRIG do HC-SR04 ao GPIO </w:t>
+      </w:r>
+      <w:r>
+        <w:rPr>
+          <w:rFonts w:ascii="Abadi" w:eastAsia="Abadi" w:hAnsi="Abadi" w:cs="Abadi"/>
+        </w:rPr>
+        <w:t>21</w:t>
+      </w:r>
+      <w:r>
+        <w:rPr>
+          <w:rFonts w:ascii="Abadi" w:eastAsia="Abadi" w:hAnsi="Abadi" w:cs="Abadi"/>
+        </w:rPr>
+        <w:t xml:space="preserve"> e o pino ECHO (passando pelo divisor de tensão) ao GPIO </w:t>
+      </w:r>
+      <w:r>
+        <w:rPr>
+          <w:rFonts w:ascii="Abadi" w:eastAsia="Abadi" w:hAnsi="Abadi" w:cs="Abadi"/>
+        </w:rPr>
+        <w:t>19</w:t>
+      </w:r>
+      <w:r>
+        <w:rPr>
+          <w:rFonts w:ascii="Abadi" w:eastAsia="Abadi" w:hAnsi="Abadi" w:cs="Abadi"/>
+        </w:rPr>
+        <w:t>. Conecte o pino de sinal do Módulo Relé ao GPIO 5.</w:t>
       </w:r>
     </w:p>
     <w:p>
@@ -1465,7 +1487,6 @@
         <w:spacing w:after="0"/>
         <w:rPr>
           <w:rFonts w:ascii="Abadi" w:eastAsia="Abadi" w:hAnsi="Abadi" w:cs="Abadi"/>
-          <w:highlight w:val="yellow"/>
         </w:rPr>
       </w:pPr>
       <w:r>
@@ -1473,33 +1494,77 @@
           <w:rFonts w:ascii="Abadi" w:eastAsia="Abadi" w:hAnsi="Abadi" w:cs="Abadi"/>
           <w:b/>
           <w:bCs/>
-          <w:highlight w:val="yellow"/>
         </w:rPr>
         <w:t>Referência Visual:</w:t>
       </w:r>
     </w:p>
     <w:p>
       <w:pPr>
-        <w:spacing w:after="0"/>
-        <w:rPr>
-          <w:rFonts w:ascii="Abadi" w:eastAsia="Abadi" w:hAnsi="Abadi" w:cs="Abadi"/>
-          <w:highlight w:val="yellow"/>
-        </w:rPr>
-      </w:pPr>
-      <w:r>
-        <w:rPr>
-          <w:rFonts w:ascii="Abadi" w:eastAsia="Abadi" w:hAnsi="Abadi" w:cs="Abadi"/>
-          <w:highlight w:val="yellow"/>
-        </w:rPr>
-        <w:t>[Inserir Foto real da montagem ou Diagrama de fiação]</w:t>
+        <w:pStyle w:val="NormalWeb"/>
+        <w:spacing w:after="0" w:afterAutospacing="0"/>
+        <w:ind w:left="360"/>
+      </w:pPr>
+      <w:r>
+        <w:rPr>
+          <w:noProof/>
+        </w:rPr>
+        <w:lastRenderedPageBreak/>
+        <w:drawing>
+          <wp:inline distT="0" distB="0" distL="0" distR="0" wp14:anchorId="3B157127" wp14:editId="3A937B80">
+            <wp:extent cx="6188710" cy="3025775"/>
+            <wp:effectExtent l="0" t="0" r="2540" b="3175"/>
+            <wp:docPr id="1053900118" name="Picture 2"/>
+            <wp:cNvGraphicFramePr>
+              <a:graphicFrameLocks xmlns:a="http://schemas.openxmlformats.org/drawingml/2006/main" noChangeAspect="1"/>
+            </wp:cNvGraphicFramePr>
+            <a:graphic xmlns:a="http://schemas.openxmlformats.org/drawingml/2006/main">
+              <a:graphicData uri="http://schemas.openxmlformats.org/drawingml/2006/picture">
+                <pic:pic xmlns:pic="http://schemas.openxmlformats.org/drawingml/2006/picture">
+                  <pic:nvPicPr>
+                    <pic:cNvPr id="0" name="Picture 2"/>
+                    <pic:cNvPicPr>
+                      <a:picLocks noChangeAspect="1" noChangeArrowheads="1"/>
+                    </pic:cNvPicPr>
+                  </pic:nvPicPr>
+                  <pic:blipFill>
+                    <a:blip r:embed="rId11" cstate="print">
+                      <a:extLst>
+                        <a:ext uri="{28A0092B-C50C-407E-A947-70E740481C1C}">
+                          <a14:useLocalDpi xmlns:a14="http://schemas.microsoft.com/office/drawing/2010/main" val="0"/>
+                        </a:ext>
+                      </a:extLst>
+                    </a:blip>
+                    <a:srcRect/>
+                    <a:stretch>
+                      <a:fillRect/>
+                    </a:stretch>
+                  </pic:blipFill>
+                  <pic:spPr bwMode="auto">
+                    <a:xfrm>
+                      <a:off x="0" y="0"/>
+                      <a:ext cx="6188710" cy="3025775"/>
+                    </a:xfrm>
+                    <a:prstGeom prst="rect">
+                      <a:avLst/>
+                    </a:prstGeom>
+                    <a:noFill/>
+                    <a:ln>
+                      <a:noFill/>
+                    </a:ln>
+                  </pic:spPr>
+                </pic:pic>
+              </a:graphicData>
+            </a:graphic>
+          </wp:inline>
+        </w:drawing>
       </w:r>
     </w:p>
     <w:p>
       <w:pPr>
         <w:spacing w:after="0"/>
-        <w:rPr>
-          <w:rFonts w:ascii="Abadi" w:eastAsia="Abadi" w:hAnsi="Abadi" w:cs="Abadi"/>
-          <w:highlight w:val="yellow"/>
+        <w:jc w:val="center"/>
+        <w:rPr>
+          <w:rFonts w:ascii="Abadi" w:eastAsia="Abadi" w:hAnsi="Abadi" w:cs="Abadi"/>
         </w:rPr>
       </w:pPr>
       <w:r>
@@ -1507,9 +1572,16 @@
           <w:rFonts w:ascii="Abadi" w:eastAsia="Abadi" w:hAnsi="Abadi" w:cs="Abadi"/>
           <w:i/>
           <w:iCs/>
-          <w:highlight w:val="yellow"/>
-        </w:rPr>
-        <w:t>Legenda: [Descrição técnica do componente e sua respectiva conexão/pino.]</w:t>
+        </w:rPr>
+        <w:t>D</w:t>
+      </w:r>
+      <w:r>
+        <w:rPr>
+          <w:rFonts w:ascii="Abadi" w:eastAsia="Abadi" w:hAnsi="Abadi" w:cs="Abadi"/>
+          <w:i/>
+          <w:iCs/>
+        </w:rPr>
+        <w:t>iagrama de montagem</w:t>
       </w:r>
     </w:p>
     <w:p>
@@ -1522,7 +1594,6 @@
         <w:spacing w:after="0"/>
         <w:rPr>
           <w:rFonts w:ascii="Abadi" w:eastAsia="Abadi" w:hAnsi="Abadi" w:cs="Abadi"/>
-          <w:highlight w:val="yellow"/>
         </w:rPr>
       </w:pPr>
       <w:r>
@@ -1613,7 +1684,6 @@
         <w:rPr>
           <w:rFonts w:ascii="Abadi" w:eastAsia="Abadi" w:hAnsi="Abadi" w:cs="Abadi"/>
         </w:rPr>
-        <w:lastRenderedPageBreak/>
         <w:t>Conecte o ESP32</w:t>
       </w:r>
       <w:r>
@@ -1626,7 +1696,7 @@
         <w:rPr>
           <w:rFonts w:ascii="Abadi" w:eastAsia="Abadi" w:hAnsi="Abadi" w:cs="Abadi"/>
         </w:rPr>
-        <w:t>S3 Heltec V3 ao PC via USB e abra o VS Code com o ambiente ESP</w:t>
+        <w:t>S3 ao PC via USB e abra o VS Code com o ambiente ESP</w:t>
       </w:r>
       <w:r>
         <w:rPr>
@@ -1669,7 +1739,19 @@
         <w:rPr>
           <w:rFonts w:ascii="Abadi" w:eastAsia="Abadi" w:hAnsi="Abadi" w:cs="Abadi"/>
         </w:rPr>
-        <w:t>Fi e endereço do broker MQTT no código.</w:t>
+        <w:t xml:space="preserve">Fi e endereço do broker MQTT no </w:t>
+      </w:r>
+      <w:r>
+        <w:rPr>
+          <w:rFonts w:ascii="Abadi" w:eastAsia="Abadi" w:hAnsi="Abadi" w:cs="Abadi"/>
+        </w:rPr>
+        <w:t>menuconifg (idf.py menuconfig)</w:t>
+      </w:r>
+      <w:r>
+        <w:rPr>
+          <w:rFonts w:ascii="Abadi" w:eastAsia="Abadi" w:hAnsi="Abadi" w:cs="Abadi"/>
+        </w:rPr>
+        <w:t>.</w:t>
       </w:r>
     </w:p>
     <w:p>
@@ -1725,7 +1807,6 @@
         <w:spacing w:after="0"/>
         <w:rPr>
           <w:rFonts w:ascii="Abadi" w:eastAsia="Abadi" w:hAnsi="Abadi" w:cs="Abadi"/>
-          <w:highlight w:val="yellow"/>
         </w:rPr>
       </w:pPr>
       <w:r>
@@ -1733,7 +1814,6 @@
           <w:rFonts w:ascii="Abadi" w:eastAsia="Abadi" w:hAnsi="Abadi" w:cs="Abadi"/>
           <w:b/>
           <w:bCs/>
-          <w:highlight w:val="yellow"/>
         </w:rPr>
         <w:t>Referência Visual:</w:t>
       </w:r>
@@ -1741,36 +1821,161 @@
     <w:p>
       <w:pPr>
         <w:spacing w:after="0"/>
-        <w:rPr>
-          <w:rFonts w:ascii="Abadi" w:eastAsia="Abadi" w:hAnsi="Abadi" w:cs="Abadi"/>
-          <w:highlight w:val="yellow"/>
-        </w:rPr>
-      </w:pPr>
-      <w:r>
-        <w:rPr>
-          <w:rFonts w:ascii="Abadi" w:eastAsia="Abadi" w:hAnsi="Abadi" w:cs="Abadi"/>
-          <w:highlight w:val="yellow"/>
-        </w:rPr>
-        <w:t>[Inserir Screenshot da interface de upload ou foto do sistema energizado]</w:t>
+        <w:ind w:left="360"/>
+        <w:rPr>
+          <w:rFonts w:ascii="Abadi" w:eastAsia="Abadi" w:hAnsi="Abadi" w:cs="Abadi"/>
+        </w:rPr>
+      </w:pPr>
+      <w:r>
+        <w:rPr>
+          <w:rFonts w:ascii="Abadi" w:eastAsia="Abadi" w:hAnsi="Abadi" w:cs="Abadi"/>
+          <w:noProof/>
+        </w:rPr>
+        <w:drawing>
+          <wp:inline distT="0" distB="0" distL="0" distR="0" wp14:anchorId="34F6B86D" wp14:editId="0635F892">
+            <wp:extent cx="4978400" cy="2108200"/>
+            <wp:effectExtent l="0" t="0" r="0" b="6350"/>
+            <wp:docPr id="1181484966" name="Picture 1"/>
+            <wp:cNvGraphicFramePr>
+              <a:graphicFrameLocks xmlns:a="http://schemas.openxmlformats.org/drawingml/2006/main" noChangeAspect="1"/>
+            </wp:cNvGraphicFramePr>
+            <a:graphic xmlns:a="http://schemas.openxmlformats.org/drawingml/2006/main">
+              <a:graphicData uri="http://schemas.openxmlformats.org/drawingml/2006/picture">
+                <pic:pic xmlns:pic="http://schemas.openxmlformats.org/drawingml/2006/picture">
+                  <pic:nvPicPr>
+                    <pic:cNvPr id="0" name="Picture 1"/>
+                    <pic:cNvPicPr>
+                      <a:picLocks noChangeAspect="1" noChangeArrowheads="1"/>
+                    </pic:cNvPicPr>
+                  </pic:nvPicPr>
+                  <pic:blipFill>
+                    <a:blip r:embed="rId12">
+                      <a:extLst>
+                        <a:ext uri="{28A0092B-C50C-407E-A947-70E740481C1C}">
+                          <a14:useLocalDpi xmlns:a14="http://schemas.microsoft.com/office/drawing/2010/main" val="0"/>
+                        </a:ext>
+                      </a:extLst>
+                    </a:blip>
+                    <a:srcRect/>
+                    <a:stretch>
+                      <a:fillRect/>
+                    </a:stretch>
+                  </pic:blipFill>
+                  <pic:spPr bwMode="auto">
+                    <a:xfrm>
+                      <a:off x="0" y="0"/>
+                      <a:ext cx="4978400" cy="2108200"/>
+                    </a:xfrm>
+                    <a:prstGeom prst="rect">
+                      <a:avLst/>
+                    </a:prstGeom>
+                    <a:noFill/>
+                    <a:ln>
+                      <a:noFill/>
+                    </a:ln>
+                  </pic:spPr>
+                </pic:pic>
+              </a:graphicData>
+            </a:graphic>
+          </wp:inline>
+        </w:drawing>
       </w:r>
     </w:p>
     <w:p>
       <w:pPr>
         <w:spacing w:after="0"/>
-        <w:rPr>
-          <w:rFonts w:ascii="Abadi" w:eastAsia="Abadi" w:hAnsi="Abadi" w:cs="Abadi"/>
-          <w:highlight w:val="yellow"/>
-        </w:rPr>
-      </w:pPr>
-      <w:r>
+        <w:jc w:val="center"/>
         <w:rPr>
           <w:rFonts w:ascii="Abadi" w:eastAsia="Abadi" w:hAnsi="Abadi" w:cs="Abadi"/>
           <w:i/>
           <w:iCs/>
+        </w:rPr>
+      </w:pPr>
+      <w:r>
+        <w:rPr>
+          <w:rFonts w:ascii="Abadi" w:eastAsia="Abadi" w:hAnsi="Abadi" w:cs="Abadi"/>
+          <w:i/>
+          <w:iCs/>
+        </w:rPr>
+        <w:t>Configurações</w:t>
+      </w:r>
+    </w:p>
+    <w:p>
+      <w:pPr>
+        <w:spacing w:after="0"/>
+        <w:rPr>
+          <w:rFonts w:ascii="Abadi" w:eastAsia="Abadi" w:hAnsi="Abadi" w:cs="Abadi"/>
+        </w:rPr>
+      </w:pPr>
+      <w:r>
+        <w:rPr>
+          <w:rFonts w:ascii="Abadi" w:eastAsia="Abadi" w:hAnsi="Abadi" w:cs="Abadi"/>
+        </w:rPr>
+        <w:lastRenderedPageBreak/>
+        <w:drawing>
+          <wp:inline distT="0" distB="0" distL="0" distR="0" wp14:anchorId="46B4E71F" wp14:editId="25CB01EE">
+            <wp:extent cx="6188710" cy="1301115"/>
+            <wp:effectExtent l="0" t="0" r="2540" b="0"/>
+            <wp:docPr id="1426865899" name="Picture 1"/>
+            <wp:cNvGraphicFramePr>
+              <a:graphicFrameLocks xmlns:a="http://schemas.openxmlformats.org/drawingml/2006/main" noChangeAspect="1"/>
+            </wp:cNvGraphicFramePr>
+            <a:graphic xmlns:a="http://schemas.openxmlformats.org/drawingml/2006/main">
+              <a:graphicData uri="http://schemas.openxmlformats.org/drawingml/2006/picture">
+                <pic:pic xmlns:pic="http://schemas.openxmlformats.org/drawingml/2006/picture">
+                  <pic:nvPicPr>
+                    <pic:cNvPr id="1426865899" name=""/>
+                    <pic:cNvPicPr/>
+                  </pic:nvPicPr>
+                  <pic:blipFill>
+                    <a:blip r:embed="rId13"/>
+                    <a:stretch>
+                      <a:fillRect/>
+                    </a:stretch>
+                  </pic:blipFill>
+                  <pic:spPr>
+                    <a:xfrm>
+                      <a:off x="0" y="0"/>
+                      <a:ext cx="6188710" cy="1301115"/>
+                    </a:xfrm>
+                    <a:prstGeom prst="rect">
+                      <a:avLst/>
+                    </a:prstGeom>
+                  </pic:spPr>
+                </pic:pic>
+              </a:graphicData>
+            </a:graphic>
+          </wp:inline>
+        </w:drawing>
+      </w:r>
+    </w:p>
+    <w:p>
+      <w:pPr>
+        <w:spacing w:after="0"/>
+        <w:jc w:val="center"/>
+        <w:rPr>
+          <w:rFonts w:ascii="Abadi" w:eastAsia="Abadi" w:hAnsi="Abadi" w:cs="Abadi"/>
+          <w:i/>
+          <w:iCs/>
+        </w:rPr>
+      </w:pPr>
+      <w:r>
+        <w:rPr>
+          <w:rFonts w:ascii="Abadi" w:eastAsia="Abadi" w:hAnsi="Abadi" w:cs="Abadi"/>
+          <w:i/>
+          <w:iCs/>
+        </w:rPr>
+        <w:t>Exemplo de funcionamento</w:t>
+      </w:r>
+    </w:p>
+    <w:p>
+      <w:pPr>
+        <w:spacing w:after="0"/>
+        <w:rPr>
+          <w:rFonts w:ascii="Abadi" w:eastAsia="Abadi" w:hAnsi="Abadi" w:cs="Abadi"/>
           <w:highlight w:val="yellow"/>
         </w:rPr>
-        <w:t>Legenda: [Descrição do indicador de sucesso no upload ou status do LED.]</w:t>
-      </w:r>
+      </w:pPr>
     </w:p>
     <w:p>
       <w:pPr>
@@ -3174,10 +3379,10 @@
       </w:pPr>
     </w:p>
     <w:sectPr>
-      <w:headerReference w:type="default" r:id="rId11"/>
-      <w:footerReference w:type="default" r:id="rId12"/>
-      <w:headerReference w:type="first" r:id="rId13"/>
-      <w:footerReference w:type="first" r:id="rId14"/>
+      <w:headerReference w:type="default" r:id="rId14"/>
+      <w:footerReference w:type="default" r:id="rId15"/>
+      <w:headerReference w:type="first" r:id="rId16"/>
+      <w:footerReference w:type="first" r:id="rId17"/>
       <w:pgSz w:w="11906" w:h="16838"/>
       <w:pgMar w:top="1440" w:right="1080" w:bottom="1440" w:left="1080" w:header="737" w:footer="708" w:gutter="0"/>
       <w:cols w:space="708"/>
@@ -3710,13 +3915,7 @@
                       <w:rPr>
                         <w:color w:val="E9ECF4" w:themeColor="background2"/>
                       </w:rPr>
-                      <w:t xml:space="preserve">Programa </w:t>
-                    </w:r>
-                    <w:r>
-                      <w:rPr>
-                        <w:color w:val="E9ECF4" w:themeColor="background2"/>
-                      </w:rPr>
-                      <w:t>Nacional de Aprendizado Acelerado em Tecnologia</w:t>
+                      <w:t>Programa Nacional de Aprendizado Acelerado em Tecnologia</w:t>
                     </w:r>
                   </w:p>
                 </w:txbxContent>
@@ -3800,7 +3999,7 @@
             </wp:anchor>
           </w:drawing>
         </mc:Choice>
-        <mc:Fallback xmlns:a="http://schemas.openxmlformats.org/drawingml/2006/main" xmlns:pic="http://schemas.openxmlformats.org/drawingml/2006/picture" xmlns:a14="http://schemas.microsoft.com/office/drawing/2010/main">
+        <mc:Fallback xmlns:a14="http://schemas.microsoft.com/office/drawing/2010/main" xmlns:pic="http://schemas.openxmlformats.org/drawingml/2006/picture" xmlns:a="http://schemas.openxmlformats.org/drawingml/2006/main">
           <w:pict>
             <v:rect id="Rectangle 4" style="position:absolute;margin-left:0;margin-top:-37pt;width:600.25pt;height:71.95pt;z-index:251664384;visibility:visible;mso-wrap-style:square;mso-width-percent:0;mso-height-percent:0;mso-wrap-distance-left:9pt;mso-wrap-distance-top:0;mso-wrap-distance-right:9pt;mso-wrap-distance-bottom:0;mso-position-horizontal:left;mso-position-horizontal-relative:page;mso-position-vertical:absolute;mso-position-vertical-relative:text;mso-width-percent:0;mso-height-percent:0;mso-width-relative:margin;mso-height-relative:margin;v-text-anchor:middle" o:spid="_x0000_s1026" fillcolor="#01093a [3204]" stroked="f" strokeweight="2pt" w14:anchorId="42279ACB" o:gfxdata="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">
               <w10:wrap anchorx="page"/>
@@ -13025,6 +13224,24 @@
       </w:tcPr>
     </w:tblStylePr>
   </w:style>
+  <w:style w:type="paragraph" w:styleId="NormalWeb">
+    <w:name w:val="Normal (Web)"/>
+    <w:basedOn w:val="Normal"/>
+    <w:uiPriority w:val="99"/>
+    <w:semiHidden/>
+    <w:unhideWhenUsed/>
+    <w:rsid w:val="002F5B2F"/>
+    <w:pPr>
+      <w:spacing w:before="100" w:beforeAutospacing="1" w:after="100" w:afterAutospacing="1" w:line="240" w:lineRule="auto"/>
+    </w:pPr>
+    <w:rPr>
+      <w:rFonts w:ascii="Times New Roman" w:eastAsia="Times New Roman" w:hAnsi="Times New Roman" w:cs="Times New Roman"/>
+      <w:color w:val="auto"/>
+      <w:sz w:val="24"/>
+      <w:szCs w:val="24"/>
+      <w:lang w:eastAsia="pt-BR"/>
+    </w:rPr>
+  </w:style>
 </w:styles>
 </file>
 
@@ -13378,10 +13595,6 @@
 </file>
 
 <file path=customXml/item1.xml><?xml version="1.0" encoding="utf-8"?>
-<b:Sources xmlns:b="http://schemas.openxmlformats.org/officeDocument/2006/bibliography" xmlns="http://schemas.openxmlformats.org/officeDocument/2006/bibliography" SelectedStyle="\APASixthEditionOfficeOnline.xsl" StyleName="APA" Version="6"/>
-</file>
-
-<file path=customXml/item2.xml><?xml version="1.0" encoding="utf-8"?>
 <p:properties xmlns:p="http://schemas.microsoft.com/office/2006/metadata/properties" xmlns:xsi="http://www.w3.org/2001/XMLSchema-instance" xmlns:pc="http://schemas.microsoft.com/office/infopath/2007/PartnerControls">
   <documentManagement>
     <lcf76f155ced4ddcb4097134ff3c332f xmlns="0337a55e-6c2c-4d63-b79a-aa3d8c227c1d">
@@ -13392,7 +13605,20 @@
 </p:properties>
 </file>
 
+<file path=customXml/item2.xml><?xml version="1.0" encoding="utf-8"?>
+<b:Sources xmlns:b="http://schemas.openxmlformats.org/officeDocument/2006/bibliography" xmlns="http://schemas.openxmlformats.org/officeDocument/2006/bibliography" SelectedStyle="\APASixthEditionOfficeOnline.xsl" StyleName="APA" Version="6"/>
+</file>
+
 <file path=customXml/item3.xml><?xml version="1.0" encoding="utf-8"?>
+<?mso-contentType ?>
+<FormTemplates xmlns="http://schemas.microsoft.com/sharepoint/v3/contenttype/forms">
+  <Display>DocumentLibraryForm</Display>
+  <Edit>DocumentLibraryForm</Edit>
+  <New>DocumentLibraryForm</New>
+</FormTemplates>
+</file>
+
+<file path=customXml/item4.xml><?xml version="1.0" encoding="utf-8"?>
 <ct:contentTypeSchema xmlns:ct="http://schemas.microsoft.com/office/2006/metadata/contentType" xmlns:ma="http://schemas.microsoft.com/office/2006/metadata/properties/metaAttributes" ct:_="" ma:_="" ma:contentTypeName="Document" ma:contentTypeID="0x0101001A9F42900677274DB5EFFFC08FB74ED9" ma:contentTypeVersion="14" ma:contentTypeDescription="Create a new document." ma:contentTypeScope="" ma:versionID="35dc7fea2fe184f47ee26c49ad6d27ed">
   <xsd:schema xmlns:xsd="http://www.w3.org/2001/XMLSchema" xmlns:xs="http://www.w3.org/2001/XMLSchema" xmlns:p="http://schemas.microsoft.com/office/2006/metadata/properties" xmlns:ns2="0337a55e-6c2c-4d63-b79a-aa3d8c227c1d" xmlns:ns3="2d462126-6299-4b3d-b3f3-d8d80c025600" targetNamespace="http://schemas.microsoft.com/office/2006/metadata/properties" ma:root="true" ma:fieldsID="d2e472a24e092181a905a67079d33ac5" ns2:_="" ns3:_="">
     <xsd:import namespace="0337a55e-6c2c-4d63-b79a-aa3d8c227c1d"/>
@@ -13599,24 +13825,7 @@
 </ct:contentTypeSchema>
 </file>
 
-<file path=customXml/item4.xml><?xml version="1.0" encoding="utf-8"?>
-<?mso-contentType ?>
-<FormTemplates xmlns="http://schemas.microsoft.com/sharepoint/v3/contenttype/forms">
-  <Display>DocumentLibraryForm</Display>
-  <Edit>DocumentLibraryForm</Edit>
-  <New>DocumentLibraryForm</New>
-</FormTemplates>
-</file>
-
 <file path=customXml/itemProps1.xml><?xml version="1.0" encoding="utf-8"?>
-<ds:datastoreItem xmlns:ds="http://schemas.openxmlformats.org/officeDocument/2006/customXml" ds:itemID="{878930A0-CBDA-43F7-B5C9-2FBD43FFD8CC}">
-  <ds:schemaRefs>
-    <ds:schemaRef ds:uri="http://schemas.openxmlformats.org/officeDocument/2006/bibliography"/>
-  </ds:schemaRefs>
-</ds:datastoreItem>
-</file>
-
-<file path=customXml/itemProps2.xml><?xml version="1.0" encoding="utf-8"?>
 <ds:datastoreItem xmlns:ds="http://schemas.openxmlformats.org/officeDocument/2006/customXml" ds:itemID="{41A70886-D638-4913-811E-25DE943FC343}">
   <ds:schemaRefs>
     <ds:schemaRef ds:uri="http://schemas.microsoft.com/office/2006/metadata/properties"/>
@@ -13627,7 +13836,23 @@
 </ds:datastoreItem>
 </file>
 
+<file path=customXml/itemProps2.xml><?xml version="1.0" encoding="utf-8"?>
+<ds:datastoreItem xmlns:ds="http://schemas.openxmlformats.org/officeDocument/2006/customXml" ds:itemID="{878930A0-CBDA-43F7-B5C9-2FBD43FFD8CC}">
+  <ds:schemaRefs>
+    <ds:schemaRef ds:uri="http://schemas.openxmlformats.org/officeDocument/2006/bibliography"/>
+  </ds:schemaRefs>
+</ds:datastoreItem>
+</file>
+
 <file path=customXml/itemProps3.xml><?xml version="1.0" encoding="utf-8"?>
+<ds:datastoreItem xmlns:ds="http://schemas.openxmlformats.org/officeDocument/2006/customXml" ds:itemID="{0E62B389-FEAB-4A4A-A22C-F4533FCE1D71}">
+  <ds:schemaRefs>
+    <ds:schemaRef ds:uri="http://schemas.microsoft.com/sharepoint/v3/contenttype/forms"/>
+  </ds:schemaRefs>
+</ds:datastoreItem>
+</file>
+
+<file path=customXml/itemProps4.xml><?xml version="1.0" encoding="utf-8"?>
 <ds:datastoreItem xmlns:ds="http://schemas.openxmlformats.org/officeDocument/2006/customXml" ds:itemID="{8173E8B0-EF27-48B2-99CC-D5706F6DFFFE}">
   <ds:schemaRefs>
     <ds:schemaRef ds:uri="http://schemas.microsoft.com/office/2006/metadata/contentType"/>
@@ -13644,12 +13869,4 @@
     <ds:schemaRef ds:uri="http://schemas.microsoft.com/internal/obd"/>
   </ds:schemaRefs>
 </ds:datastoreItem>
-</file>
-
-<file path=customXml/itemProps4.xml><?xml version="1.0" encoding="utf-8"?>
-<ds:datastoreItem xmlns:ds="http://schemas.openxmlformats.org/officeDocument/2006/customXml" ds:itemID="{0E62B389-FEAB-4A4A-A22C-F4533FCE1D71}">
-  <ds:schemaRefs>
-    <ds:schemaRef ds:uri="http://schemas.microsoft.com/sharepoint/v3/contenttype/forms"/>
-  </ds:schemaRefs>
-</ds:datastoreItem>
 </file>
</xml_diff>